<commit_message>
rca-shift-share-cptpp-china: propuesta a Malca autocontenida para lectura directa
Quita el marco de "carta para correo" (quitado "le escribo", "adjunto a
este correo") y la hace legible como documento independiente: agrega la
tabla comparativa de las 4 pruebas de gobernanza (OLS vs PPML) para que no
dependa del docx tecnico completo para seguir el argumento.
</commit_message>
<xml_diff>
--- a/investigaciones/rca-shift-share-cptpp-china/propuesta/Propuesta-Malca-CPTPP-China.docx
+++ b/investigaciones/rca-shift-share-cptpp-china/propuesta/Propuesta-Malca-CPTPP-China.docx
@@ -11,14 +11,6 @@
           <w:i/>
           <w:iCs/>
         </w:rPr>
-        <w:t xml:space="preserve">Lima, 18 de octubre de 2026</w:t>
-      </w:r>
-    </w:p>
-    <w:p>
-      <w:pPr>
-        <w:spacing w:after="160"/>
-      </w:pPr>
-      <w:r>
         <w:t xml:space="preserve">Para: Oscar Malca, Vicedecano de Negocios Internacionales, CIUP — Universidad del Pacífico</w:t>
       </w:r>
     </w:p>
@@ -27,6 +19,10 @@
         <w:spacing w:after="160"/>
       </w:pPr>
       <w:r>
+        <w:rPr>
+          <w:i/>
+          <w:iCs/>
+        </w:rPr>
         <w:t xml:space="preserve">De: Ricardo Cuba, economista · Asistente de investigación, CIUP</w:t>
       </w:r>
     </w:p>
@@ -65,15 +61,15 @@
         <w:spacing w:after="120" w:before="280"/>
       </w:pPr>
       <w:r>
-        <w:t xml:space="preserve">Por qué le escribo</w:t>
-      </w:r>
-    </w:p>
-    <w:p>
-      <w:pPr>
-        <w:spacing w:after="160"/>
-      </w:pPr>
-      <w:r>
-        <w:t xml:space="preserve">Le escribo porque este proyecto nace directamente de dos líneas suyas: "Análisis e Identificación de las Potenciales Oportunidades Comerciales con Países miembros del TPP" (2016, Journal of Business, Universidad del Pacífico) y "América Latina y Asia Pacífico" (2019). Ambos papers preguntan qué determina que Perú aproveche o no las oportunidades comerciales de acuerdos como el CPTPP y de mercados como China. Este proyecto retoma esa pregunta con datos de comercio bilateral 2015-2024 (CEPII BACI, Banco Mundial WDI/WGI) y la somete a una prueba econométrica más exigente de la que suele aplicarse en la literatura aplicada — con un resultado que creo le va a interesar, porque contradice la hipótesis con la que el proyecto arrancó.</w:t>
+        <w:t xml:space="preserve">Origen y motivación</w:t>
+      </w:r>
+    </w:p>
+    <w:p>
+      <w:pPr>
+        <w:spacing w:after="160"/>
+      </w:pPr>
+      <w:r>
+        <w:t xml:space="preserve">Este proyecto nace directamente de dos líneas de investigación suyas: "Análisis e Identificación de las Potenciales Oportunidades Comerciales con Países miembros del TPP" (2016, Journal of Business, Universidad del Pacífico) y "América Latina y Asia Pacífico" (2019). Ambos papers preguntan qué determina que Perú aproveche o no las oportunidades comerciales de acuerdos como el CPTPP y de mercados como China. Este proyecto retoma esa pregunta con datos de comercio bilateral 2015-2024 (CEPII BACI, Banco Mundial WDI/WGI) y la somete a una prueba econométrica más exigente de la que suele aplicarse en la literatura aplicada — con un resultado que vale la pena mirar de cerca, porque contradice la hipótesis con la que el proyecto arrancó.</w:t>
       </w:r>
     </w:p>
     <w:p>
@@ -107,7 +103,214 @@
         <w:spacing w:after="160"/>
       </w:pPr>
       <w:r>
-        <w:t xml:space="preserve">Ese resultado se sometió a cuatro pruebas de robustez independientes — el promedio de gobernanza, las seis dimensiones del índice por separado, una interacción con intensidad contractual (Nunn 2007) y un diseño de diferencias-en-diferencias alrededor de la entrada en vigor del CPTPP — todas bajo el estimador correcto para datos de comercio con ceros (PPML, Santos Silva y Tenreyro 2006) y con los datos depurados de oro, cobre y combustibles (cuya geografía de refinación y reexportación distorsiona cualquier regresión de comercio que no los excluya explícitamente). Las cuatro pruebas dieron nulo o sin significancia estadística. El diagnóstico: sin controlar por el tamaño de la economía del socio, el coeficiente de gobernanza sube en vez de bajar — buena parte de lo que el modelo original atribuía a "gobernanza" era, en realidad, el nivel de desarrollo del socio, correlacionado con su puntaje institucional pero no la causa del vínculo comercial.</w:t>
+        <w:t xml:space="preserve">Ese resultado se sometió a cuatro pruebas de robustez independientes, todas bajo el estimador correcto para datos de comercio con ceros (PPML, Santos Silva y Tenreyro 2006) y con los datos depurados de oro, cobre y combustibles — cuya geografía de refinación y reexportación distorsiona cualquier regresión de comercio que no los excluya explícitamente. Las cuatro dieron nulo o sin significancia estadística:</w:t>
+      </w:r>
+    </w:p>
+    <w:tbl>
+      <w:tblPr>
+        <w:tblW w:type="dxa" w:w="9360"/>
+        <w:tblBorders>
+          <w:top w:val="single" w:color="auto" w:sz="4"/>
+          <w:left w:val="single" w:color="auto" w:sz="4"/>
+          <w:bottom w:val="single" w:color="auto" w:sz="4"/>
+          <w:right w:val="single" w:color="auto" w:sz="4"/>
+          <w:insideH w:val="single" w:color="auto" w:sz="4"/>
+          <w:insideV w:val="single" w:color="auto" w:sz="4"/>
+        </w:tblBorders>
+      </w:tblPr>
+      <w:tblGrid>
+        <w:gridCol w:w="3200"/>
+        <w:gridCol w:w="3080"/>
+        <w:gridCol w:w="3080"/>
+      </w:tblGrid>
+      <w:tr>
+        <w:trPr>
+          <w:tblHeader/>
+        </w:trPr>
+        <w:tc>
+          <w:tcPr>
+            <w:tcW w:type="dxa" w:w="3200"/>
+            <w:shd w:fill="2F5496" w:val="clear"/>
+          </w:tcPr>
+          <w:p>
+            <w:r>
+              <w:rPr>
+                <w:b/>
+                <w:bCs/>
+                <w:color w:val="FFFFFF"/>
+              </w:rPr>
+              <w:t xml:space="preserve">Hipótesis</w:t>
+            </w:r>
+          </w:p>
+        </w:tc>
+        <w:tc>
+          <w:tcPr>
+            <w:tcW w:type="dxa" w:w="3080"/>
+            <w:shd w:fill="2F5496" w:val="clear"/>
+          </w:tcPr>
+          <w:p>
+            <w:r>
+              <w:rPr>
+                <w:b/>
+                <w:bCs/>
+                <w:color w:val="FFFFFF"/>
+              </w:rPr>
+              <w:t xml:space="preserve">Bajo OLS log-lineal (diseño original)</w:t>
+            </w:r>
+          </w:p>
+        </w:tc>
+        <w:tc>
+          <w:tcPr>
+            <w:tcW w:type="dxa" w:w="3080"/>
+            <w:shd w:fill="2F5496" w:val="clear"/>
+          </w:tcPr>
+          <w:p>
+            <w:r>
+              <w:rPr>
+                <w:b/>
+                <w:bCs/>
+                <w:color w:val="FFFFFF"/>
+              </w:rPr>
+              <w:t xml:space="preserve">Bajo PPML (estimador correcto)</w:t>
+            </w:r>
+          </w:p>
+        </w:tc>
+      </w:tr>
+      <w:tr>
+        <w:tc>
+          <w:tcPr>
+            <w:tcW w:type="dxa" w:w="3200"/>
+          </w:tcPr>
+          <w:p>
+            <w:r>
+              <w:t xml:space="preserve">WGI promedio explica exportaciones</w:t>
+            </w:r>
+          </w:p>
+        </w:tc>
+        <w:tc>
+          <w:tcPr>
+            <w:tcW w:type="dxa" w:w="3080"/>
+          </w:tcPr>
+          <w:p>
+            <w:r>
+              <w:t xml:space="preserve">+0.667, p&lt;0.001 (n=1,496)</w:t>
+            </w:r>
+          </w:p>
+        </w:tc>
+        <w:tc>
+          <w:tcPr>
+            <w:tcW w:type="dxa" w:w="3080"/>
+          </w:tcPr>
+          <w:p>
+            <w:r>
+              <w:t xml:space="preserve">+0.150, p=0.35 (misma submuestra)</w:t>
+            </w:r>
+          </w:p>
+        </w:tc>
+      </w:tr>
+      <w:tr>
+        <w:tc>
+          <w:tcPr>
+            <w:tcW w:type="dxa" w:w="3200"/>
+          </w:tcPr>
+          <w:p>
+            <w:r>
+              <w:t xml:space="preserve">Las 6 dimensiones WGI por separado</w:t>
+            </w:r>
+          </w:p>
+        </w:tc>
+        <w:tc>
+          <w:tcPr>
+            <w:tcW w:type="dxa" w:w="3080"/>
+          </w:tcPr>
+          <w:p>
+            <w:r>
+              <w:t xml:space="preserve">6 de 6 positivas y significativas</w:t>
+            </w:r>
+          </w:p>
+        </w:tc>
+        <w:tc>
+          <w:tcPr>
+            <w:tcW w:type="dxa" w:w="3080"/>
+          </w:tcPr>
+          <w:p>
+            <w:r>
+              <w:t xml:space="preserve">0 de 6 significativas al 5%</w:t>
+            </w:r>
+          </w:p>
+        </w:tc>
+      </w:tr>
+      <w:tr>
+        <w:tc>
+          <w:tcPr>
+            <w:tcW w:type="dxa" w:w="3200"/>
+          </w:tcPr>
+          <w:p>
+            <w:r>
+              <w:t xml:space="preserve">Gobernanza × intensidad contractual (Nunn 2007)</w:t>
+            </w:r>
+          </w:p>
+        </w:tc>
+        <w:tc>
+          <w:tcPr>
+            <w:tcW w:type="dxa" w:w="3080"/>
+          </w:tcPr>
+          <w:p>
+            <w:r>
+              <w:t xml:space="preserve">—</w:t>
+            </w:r>
+          </w:p>
+        </w:tc>
+        <w:tc>
+          <w:tcPr>
+            <w:tcW w:type="dxa" w:w="3080"/>
+          </w:tcPr>
+          <w:p>
+            <w:r>
+              <w:t xml:space="preserve">Nulo o signo contrario a la teoría (p=0.014)</w:t>
+            </w:r>
+          </w:p>
+        </w:tc>
+      </w:tr>
+      <w:tr>
+        <w:tc>
+          <w:tcPr>
+            <w:tcW w:type="dxa" w:w="3200"/>
+          </w:tcPr>
+          <w:p>
+            <w:r>
+              <w:t xml:space="preserve">Diferencias-en-diferencias, entrada en vigor del CPTPP</w:t>
+            </w:r>
+          </w:p>
+        </w:tc>
+        <w:tc>
+          <w:tcPr>
+            <w:tcW w:type="dxa" w:w="3080"/>
+          </w:tcPr>
+          <w:p>
+            <w:r>
+              <w:t xml:space="preserve">+0.145, p=0.043 (exportaciones totales)</w:t>
+            </w:r>
+          </w:p>
+        </w:tc>
+        <w:tc>
+          <w:tcPr>
+            <w:tcW w:type="dxa" w:w="3080"/>
+          </w:tcPr>
+          <w:p>
+            <w:r>
+              <w:t xml:space="preserve">+0.154 a +0.167, p=0.11-0.16 (sin commodities ni hubs)</w:t>
+            </w:r>
+          </w:p>
+        </w:tc>
+      </w:tr>
+    </w:tbl>
+    <w:p>
+      <w:pPr>
+        <w:spacing w:after="160"/>
+      </w:pPr>
+      <w:r>
+        <w:t xml:space="preserve">El diagnóstico: sin controlar por el tamaño de la economía del socio, el coeficiente de gobernanza sube en vez de bajar (+0.658, p=0.07) — buena parte de lo que el modelo original atribuía a "gobernanza" era, en realidad, el nivel de desarrollo del socio, correlacionado con su puntaje institucional pero no la causa del vínculo comercial. El VIF de todas las variables es inferior a 2.2, lo que descarta multicolinealidad como explicación alternativa.</w:t>
       </w:r>
     </w:p>
     <w:p>
@@ -116,7 +319,7 @@
         <w:spacing w:after="120" w:before="280"/>
       </w:pPr>
       <w:r>
-        <w:t xml:space="preserve">Qué sí se sostuvo</w:t>
+        <w:t xml:space="preserve">Qué sí se sostuvo: el espacio de productos</w:t>
       </w:r>
     </w:p>
     <w:p>
@@ -167,7 +370,7 @@
         <w:spacing w:after="120" w:before="280"/>
       </w:pPr>
       <w:r>
-        <w:t xml:space="preserve">Qué estoy proponiendo</w:t>
+        <w:t xml:space="preserve">Qué le pediría</w:t>
       </w:r>
     </w:p>
     <w:p>
@@ -214,7 +417,7 @@
         <w:spacing w:after="80"/>
       </w:pPr>
       <w:r>
-        <w:t xml:space="preserve">Si le parece publicable, su criterio sobre la revista más adecuada — la propuesta formal adjunta identifica tres candidatas (International Journal of Emerging Markets, Journal of Economic Structures, The Journal of International Trade &amp; Economic Development), pero usted conoce mejor que yo el terreno real de revisión por pares en esta área.</w:t>
+        <w:t xml:space="preserve">Si le parece publicable, su criterio sobre la revista más adecuada — la propuesta formal identifica tres candidatas (International Journal of Emerging Markets, Journal of Economic Structures, The Journal of International Trade &amp; Economic Development), pero usted conoce mejor que yo el terreno real de revisión por pares en esta área.</w:t>
       </w:r>
     </w:p>
     <w:p>
@@ -223,23 +426,23 @@
         <w:spacing w:after="120" w:before="280"/>
       </w:pPr>
       <w:r>
-        <w:t xml:space="preserve">Qué adjunto</w:t>
-      </w:r>
-    </w:p>
-    <w:p>
-      <w:pPr>
-        <w:spacing w:after="160"/>
-      </w:pPr>
-      <w:r>
-        <w:t xml:space="preserve">La propuesta formal completa — con la tabla comparativa de las cuatro pruebas de gobernanza, el detalle metodológico de las cuatro técnicas usadas (ventaja comparativa revelada, shift-share, gravedad PPML, espacio de productos) y el cronograma — está en Propuesta-Gobernanza-Competitividad-CPTPP.docx, adjunto a este correo. Todo el código y los datos del proyecto están versionados y disponibles si quiere revisar el detalle de cualquier especificación.</w:t>
-      </w:r>
-    </w:p>
-    <w:p>
-      <w:pPr>
-        <w:spacing w:after="160"/>
-      </w:pPr>
-      <w:r>
-        <w:t xml:space="preserve">Quedo atento a su disponibilidad para conversar, por correo o en una reunión breve, en las próximas semanas.</w:t>
+        <w:t xml:space="preserve">Documento técnico complementario</w:t>
+      </w:r>
+    </w:p>
+    <w:p>
+      <w:pPr>
+        <w:spacing w:after="160"/>
+      </w:pPr>
+      <w:r>
+        <w:t xml:space="preserve">La propuesta formal completa — con el detalle metodológico de las cuatro técnicas usadas (ventaja comparativa revelada, shift-share, gravedad PPML, espacio de productos), la batería completa de endogeneidad y el cronograma — está en Propuesta-Gobernanza-Competitividad-CPTPP.docx, incluida junto con este documento. Todo el código y los datos del proyecto están versionados y disponibles si quiere revisar el detalle de cualquier especificación.</w:t>
+      </w:r>
+    </w:p>
+    <w:p>
+      <w:pPr>
+        <w:spacing w:after="160"/>
+      </w:pPr>
+      <w:r>
+        <w:t xml:space="preserve">Quedo atento a sus comentarios, por correo o en una reunión breve, en las próximas semanas.</w:t>
       </w:r>
     </w:p>
     <w:p>

</xml_diff>